<commit_message>
Fix em dashes introduced by the text extraction into Word and text versions
Co-Authored-By: Claude Fable 5 <noreply@anthropic.com>
Claude-Session: https://claude.ai/code/session_01Jo1oahM4mWVwvy8L6PwFuj
</commit_message>
<xml_diff>
--- a/bbrg-gart-brief.docx
+++ b/bbrg-gart-brief.docx
@@ -341,7 +341,7 @@
           <w:sz w:val="21"/>
           <w:szCs w:val="21"/>
         </w:rPr>
-        <w:t xml:space="preserve">$2.61M — FY25 net income</w:t>
+        <w:t xml:space="preserve">$2.61M · FY25 net income</w:t>
       </w:r>
     </w:p>
     <w:p>
@@ -360,7 +360,7 @@
           <w:sz w:val="21"/>
           <w:szCs w:val="21"/>
         </w:rPr>
-        <w:t xml:space="preserve">$2.76M — FY25 royalties · +16%</w:t>
+        <w:t xml:space="preserve">$2.76M · FY25 royalties · +16%</w:t>
       </w:r>
     </w:p>
     <w:p>
@@ -379,7 +379,7 @@
           <w:sz w:val="21"/>
           <w:szCs w:val="21"/>
         </w:rPr>
-        <w:t xml:space="preserve">33 — Outlets · 1 exit in 3 yrs</w:t>
+        <w:t xml:space="preserve">33 · Outlets · 1 exit in 3 yrs</w:t>
       </w:r>
     </w:p>
     <w:p>
@@ -398,7 +398,7 @@
           <w:sz w:val="21"/>
           <w:szCs w:val="21"/>
         </w:rPr>
-        <w:t xml:space="preserve">+10.7% — Q1 2026 comp sales</w:t>
+        <w:t xml:space="preserve">+10.7% · Q1 2026 comp sales</w:t>
       </w:r>
     </w:p>
     <w:p>

</xml_diff>

<commit_message>
Scrub rhetorical negation; build out the real estate model across all docs
Replace not-X-it-is-Y constructions with plain statements. Add three real
estate tracks: sites under the seven company operated restaurants bought at
closing, the site for every new store, and sale-leasebacks with franchisees
who own their buildings. Flowchart nodes now name the platform build.

Co-Authored-By: Claude Fable 5 <noreply@anthropic.com>
Claude-Session: https://claude.ai/code/session_01Jo1oahM4mWVwvy8L6PwFuj
</commit_message>
<xml_diff>
--- a/bbrg-gart-brief.docx
+++ b/bbrg-gart-brief.docx
@@ -610,7 +610,7 @@
           <w:sz w:val="21"/>
           <w:szCs w:val="21"/>
         </w:rPr>
-        <w:t xml:space="preserve">The firm money is roughly 4.5x current earnings; the full package including the earnout is 7.7x. The stores are already doing their part: the Q1 2026 pace annualizes near $85M of system sales, which at the current blend implies royalties near $3.4M against the $2.76M FY25 base before any corporate action. The build converts that store performance into franchisor value through five levers. Same store growth compounds against a royalty that is a percentage of sales, with legacy stores below the current rate stepping up as their agreements renew. Stores get bought at prices a third party has already validated through the match right. Real estate accrues deal by deal. The development pipeline behind $586K of deferred fees gets serviced and converted into open stores. New units open faster with holdco capital and support; franchise fee revenue doubled to $121K in FY25. </w:t>
+        <w:t xml:space="preserve">The firm money is roughly 4.5x current earnings; the full package including the earnout is 7.7x. The stores are already doing their part: the Q1 2026 pace annualizes near $85M of system sales, which at the current blend implies royalties near $3.4M against the $2.76M FY25 base before any corporate action. The build converts that store performance into franchisor value through five levers. Same store growth compounds against a royalty that is a percentage of sales, with legacy stores below the current rate stepping up as their agreements renew. Stores get bought at prices a third party has already validated through the match right. Real estate is acquired alongside the operations: the sites beneath the seven company operated restaurants where the sellers own them, bought at appraised value at closing, and the site for every new store the system opens, taken by the holdco and leased to whoever runs the restaurant. The development pipeline behind $586K of deferred fees gets serviced and converted into open stores. New units open faster with holdco capital and support; franchise fee revenue doubled to $121K in FY25. </w:t>
       </w:r>
       <w:r>
         <w:rPr>
@@ -1815,6 +1815,59 @@
           <w:sz w:val="21"/>
           <w:szCs w:val="21"/>
         </w:rPr>
+        <w:t xml:space="preserve">If the sellers own the sites under the company operated restaurants:</w:t>
+      </w:r>
+      <w:r>
+        <w:rPr>
+          <w:rFonts w:ascii="Georgia" w:cs="Georgia" w:eastAsia="Georgia" w:hAnsi="Georgia"/>
+          <w:i w:val="false"/>
+          <w:iCs w:val="false"/>
+          <w:color w:val="23272E"/>
+          <w:sz w:val="21"/>
+          <w:szCs w:val="21"/>
+        </w:rPr>
+        <w:t xml:space="preserve"> those properties are bought at appraised value at closing, papered as a related party transaction with an independent appraisal, a market rate lease, and Gart consent. </w:t>
+      </w:r>
+      <w:r>
+        <w:rPr>
+          <w:rFonts w:ascii="Georgia" w:cs="Georgia" w:eastAsia="Georgia" w:hAnsi="Georgia"/>
+          <w:b/>
+          <w:bCs/>
+          <w:i w:val="false"/>
+          <w:iCs w:val="false"/>
+          <w:color w:val="23272E"/>
+          <w:sz w:val="21"/>
+          <w:szCs w:val="21"/>
+        </w:rPr>
+        <w:t xml:space="preserve">If a third party owns them:</w:t>
+      </w:r>
+      <w:r>
+        <w:rPr>
+          <w:rFonts w:ascii="Georgia" w:cs="Georgia" w:eastAsia="Georgia" w:hAnsi="Georgia"/>
+          <w:i w:val="false"/>
+          <w:iCs w:val="false"/>
+          <w:color w:val="23272E"/>
+          <w:sz w:val="21"/>
+          <w:szCs w:val="21"/>
+        </w:rPr>
+        <w:t xml:space="preserve"> the position starts with new store sites and with franchisees who own their buildings and want liquidity. Ownership of all 33 addresses is public record and gets pulled during diligence at no cost, before any real estate capital is committed.</w:t>
+      </w:r>
+    </w:p>
+    <w:p>
+      <w:pPr>
+        <w:spacing w:after="180" w:line="320"/>
+      </w:pPr>
+      <w:r>
+        <w:rPr>
+          <w:rFonts w:ascii="Georgia" w:cs="Georgia" w:eastAsia="Georgia" w:hAnsi="Georgia"/>
+          <w:b/>
+          <w:bCs/>
+          <w:i w:val="false"/>
+          <w:iCs w:val="false"/>
+          <w:color w:val="23272E"/>
+          <w:sz w:val="21"/>
+          <w:szCs w:val="21"/>
+        </w:rPr>
         <w:t xml:space="preserve">If executed agreements confirm stores at or past expiration</w:t>
       </w:r>
       <w:r>
@@ -1855,7 +1908,7 @@
           <w:sz w:val="21"/>
           <w:szCs w:val="21"/>
         </w:rPr>
-        <w:t xml:space="preserve"> California will not enforce the post term covenant, so the case gets priced rather than argued. The grid values that bloc's royalties at zero until papered, and the deal stands on the remainder or walks. This is why the expired agreements read in week two alongside the OA and the license.</w:t>
+        <w:t xml:space="preserve"> California will not enforce the post term covenant, so the grid prices that outcome instead of litigating it. The grid values that bloc's royalties at zero until papered, and the deal stands on the remainder or walks. This is why the expired agreements read in week two alongside the OA and the license.</w:t>
       </w:r>
     </w:p>
     <w:p>
@@ -2165,18 +2218,18 @@
           <w:sz w:val="21"/>
           <w:szCs w:val="21"/>
         </w:rPr>
-        <w:t xml:space="preserve">real estate accrues alongside</w:t>
-      </w:r>
-      <w:r>
-        <w:rPr>
-          <w:rFonts w:ascii="Georgia" w:cs="Georgia" w:eastAsia="Georgia" w:hAnsi="Georgia"/>
-          <w:i w:val="false"/>
-          <w:iCs w:val="false"/>
-          <w:color w:val="23272E"/>
-          <w:sz w:val="21"/>
-          <w:szCs w:val="21"/>
-        </w:rPr>
-        <w:t xml:space="preserve">: leases assigned on transfers, sites that come with store buys, property purchased when it pencils. Bret and Mike come in on the same structure when ready, and a second Gart draw happens </w:t>
+        <w:t xml:space="preserve">holdco takes the ground</w:t>
+      </w:r>
+      <w:r>
+        <w:rPr>
+          <w:rFonts w:ascii="Georgia" w:cs="Georgia" w:eastAsia="Georgia" w:hAnsi="Georgia"/>
+          <w:i w:val="false"/>
+          <w:iCs w:val="false"/>
+          <w:color w:val="23272E"/>
+          <w:sz w:val="21"/>
+          <w:szCs w:val="21"/>
+        </w:rPr>
+        <w:t xml:space="preserve">: sites under the company operated restaurants, sites for new stores, and sale and leasebacks with franchisees who own their buildings. Bret and Mike come in on the same structure when ready, and a second Gart draw happens </w:t>
       </w:r>
       <w:r>
         <w:rPr>
@@ -3712,23 +3765,23 @@
           <w:sz w:val="23"/>
           <w:szCs w:val="23"/>
         </w:rPr>
-        <w:t xml:space="preserve">Real estate accrues with each transaction</w:t>
-      </w:r>
-    </w:p>
-    <w:p>
-      <w:pPr>
-        <w:spacing w:after="180" w:line="320"/>
-      </w:pPr>
-      <w:r>
-        <w:rPr>
-          <w:rFonts w:ascii="Georgia" w:cs="Georgia" w:eastAsia="Georgia" w:hAnsi="Georgia"/>
-          <w:i w:val="false"/>
-          <w:iCs w:val="false"/>
-          <w:color w:val="23272E"/>
-          <w:sz w:val="21"/>
-          <w:szCs w:val="21"/>
-        </w:rPr>
-        <w:t xml:space="preserve">Every renewal and store purchase is a site decision. Leases get assigned on transfers, locations come with store buys, and property gets bought when it pencils.</w:t>
+        <w:t xml:space="preserve">The holdco takes the ground under the system</w:t>
+      </w:r>
+    </w:p>
+    <w:p>
+      <w:pPr>
+        <w:spacing w:after="180" w:line="320"/>
+      </w:pPr>
+      <w:r>
+        <w:rPr>
+          <w:rFonts w:ascii="Georgia" w:cs="Georgia" w:eastAsia="Georgia" w:hAnsi="Georgia"/>
+          <w:i w:val="false"/>
+          <w:iCs w:val="false"/>
+          <w:color w:val="23272E"/>
+          <w:sz w:val="21"/>
+          <w:szCs w:val="21"/>
+        </w:rPr>
+        <w:t xml:space="preserve">The franchisor owns no property today. Three tracks build the position: the sites under the seven company operated restaurants, bought at appraised value from sellers already at the table; the site for every new store, taken by the holdco and leased to the operator whether the restaurant is company run or franchised; and franchisee owned sites offered a sale and leaseback, so an owner converts trapped equity to cash and keeps running the store. Rent sits alongside royalty, the property finances against the lease, and depreciation shelters the distributions. A public records review of all 33 addresses costs nothing and establishes which sites are reachable.</w:t>
       </w:r>
     </w:p>
     <w:p>
@@ -3776,7 +3829,7 @@
           <w:sz w:val="21"/>
           <w:szCs w:val="21"/>
         </w:rPr>
-        <w:t xml:space="preserve">New stores sign the current form from day one: $35,000 initial fee, then 5% plus 1% weekly. $583K of prepaid development deposits sit on the books, two franchise agreements are signed with stores not yet open, the FDD projects three franchised openings next year, and franchise fee revenue doubled in FY25. The holdco adds capital and support to open faster, with the pace set by operations rather than fee collection. Seller side holdco equity has two doors: Tom's, through the JJ&amp;N contribution, and store owners', earned by opening units and hitting growth marks under a written program securities counsel scopes. The operator equity sits separately in the sponsor waterfall. [Item 5] [Exhibit B]</w:t>
+        <w:t xml:space="preserve">New stores sign the current form from day one: $35,000 initial fee, then 5% plus 1% weekly. Each new store is a site decision before it is a franchise decision, since site cost is the largest barrier to a good operator opening and a holdco that holds the ground removes it. $583K of prepaid development deposits sit on the books, two franchise agreements are signed with stores not yet open, the FDD projects three franchised openings next year, and franchise fee revenue doubled in FY25. The holdco adds capital and support to open faster, with the pace set by operations rather than fee collection. Seller side holdco equity has two doors: Tom's, through the JJ&amp;N contribution, and store owners', earned by opening units and hitting growth marks under a written program securities counsel scopes. The operator equity sits separately in the sponsor waterfall. [Item 5] [Exhibit B]</w:t>
       </w:r>
     </w:p>
     <w:p>

</xml_diff>

<commit_message>
Cut diligence budget to $450K-$650K; add store and real estate acquisition tracks
Company operated base now has three named sources: affiliate stores bought
where sellers will sell, franchised stores bought with their buildings on
owner exits, and new units on platform controlled sites. Loss bounds
updated to $100K-$500K.

Co-Authored-By: Claude Fable 5 <noreply@anthropic.com>
Claude-Session: https://claude.ai/code/session_01Jo1oahM4mWVwvy8L6PwFuj
</commit_message>
<xml_diff>
--- a/bbrg-gart-brief.docx
+++ b/bbrg-gart-brief.docx
@@ -610,7 +610,7 @@
           <w:sz w:val="21"/>
           <w:szCs w:val="21"/>
         </w:rPr>
-        <w:t xml:space="preserve">The firm money is roughly 4.5x current earnings; the full package including the earnout is 7.7x. The stores are already doing their part: the Q1 2026 pace annualizes near $85M of system sales, which at the current blend implies royalties near $3.4M against the $2.76M FY25 base before any corporate action. The build converts that store performance into franchisor value through five levers. Same store growth compounds against a royalty that is a percentage of sales, with legacy stores below the current rate stepping up as their agreements renew. Stores get bought at prices a third party has already validated through the match right. Real estate is acquired alongside the operations: the sites beneath the seven company operated restaurants where the sellers own them, bought at appraised value at closing, and the site for every new store the system opens, taken by the holdco and leased to whoever runs the restaurant. The development pipeline behind $586K of deferred fees gets serviced and converted into open stores. New units open faster with holdco capital and support; franchise fee revenue doubled to $121K in FY25. </w:t>
+        <w:t xml:space="preserve">The firm money is roughly 4.5x current earnings; the full package including the earnout is 7.7x. The stores are already doing their part: the Q1 2026 pace annualizes near $85M of system sales, which at the current blend implies royalties near $3.4M against the $2.76M FY25 base before any corporate action. The build converts that store performance into franchisor value through five levers. Same store growth compounds against a royalty that is a percentage of sales, with legacy stores below the current rate stepping up as their agreements renew. Stores get bought at prices a third party has already validated through the match right; any affiliate restaurant the sellers will sell gets bought outright, and a franchised store gets bought together with its building when the owner wants to exit, converting a 5% royalty into full store economics plus the ground. Real estate is acquired alongside the operations: the sites beneath the seven company operated restaurants where the sellers own them, bought at appraised value at closing, and the site for every new store the system opens, taken by the holdco and leased to whoever runs the restaurant. The development pipeline behind $586K of deferred fees gets serviced and converted into open stores. New units open faster with holdco capital and support; franchise fee revenue doubled to $121K in FY25. </w:t>
       </w:r>
       <w:r>
         <w:rPr>
@@ -1797,7 +1797,7 @@
           <w:sz w:val="21"/>
           <w:szCs w:val="21"/>
         </w:rPr>
-        <w:t xml:space="preserve"> They are owned by the sellers and their families, so this is a negotiated price term rather than free value, and it is not underwritten in the return case. What is not optional is paper: after closing those stores trade under marks the holdco owns, so each needs a written license executed at closing. Two are owned by the minority members, and charging a controlled entity's minority a royalty they never paid invites a claim, so their license settles when their 45% does. Tom's Del Mar store sits inside his package on a current form agreement. The remaining four turn on ownership the document pull confirms, and the price reflects whatever they sign.</w:t>
+        <w:t xml:space="preserve"> They are owned by the sellers and their families, so this is a negotiated price term rather than free value, and it is not underwritten in the return case. The preference is to buy: any affiliate store the sellers will sell joins the company operated base at closing, with its real estate where they own it. What is not optional is paper: after closing those stores trade under marks the holdco owns, so each needs a written license executed at closing. Two are owned by the minority members, and charging a controlled entity's minority a royalty they never paid invites a claim, so their license settles when their 45% does. Tom's Del Mar store sits inside his package on a current form agreement. The remaining four turn on ownership the document pull confirms, and the price reflects whatever they sign.</w:t>
       </w:r>
     </w:p>
     <w:p>
@@ -2586,7 +2586,7 @@
           <w:sz w:val="21"/>
           <w:szCs w:val="21"/>
         </w:rPr>
-        <w:t xml:space="preserve">, plus legal, accounting, lien searches, and the FA file review. All in, a budget of $900K to $1.4M across 90 to 120 days, staged behind the week two read: franchise regulatory, corporate, tax, and IP counsel, the full FA file review, and an independent quality of earnings not run by the operating partners (the audit opinion carries no legible firm name). Work fees pay monthly and credit against the deal team's closing fee if we fund. If a gate fails, spending stops there.</w:t>
+        <w:t xml:space="preserve">, plus legal, accounting, lien searches, and the FA file review. All in, a budget of $450K to $650K across 90 to 120 days, staged behind the week two read: franchise regulatory, corporate, tax, and IP counsel, the full FA file review, and an independent quality of earnings not run by the operating partners (the audit opinion carries no legible firm name). Work fees pay monthly and credit against the deal team's closing fee if we fund. If a gate fails, spending stops there.</w:t>
       </w:r>
     </w:p>
     <w:p>
@@ -3733,7 +3733,7 @@
           <w:sz w:val="21"/>
           <w:szCs w:val="21"/>
         </w:rPr>
-        <w:t xml:space="preserve">Any real offer has to be shown to us in full, and we can take the same deal within 15 days. We acquire at prices a third party already validated. [FA §12.3(b) and (c)]</w:t>
+        <w:t xml:space="preserve">Any real offer has to be shown to us in full, and we can take the same deal within 15 days. We acquire at prices a third party already validated. Where the selling owner also holds the building, the store and the real estate get bought together and the location converts to company operation. [FA §12.3(b) and (c)]</w:t>
       </w:r>
     </w:p>
     <w:p>
@@ -3781,7 +3781,7 @@
           <w:sz w:val="21"/>
           <w:szCs w:val="21"/>
         </w:rPr>
-        <w:t xml:space="preserve">The franchisor owns no property today. Three tracks build the position: the sites under the seven company operated restaurants, bought at appraised value from sellers already at the table; the site for every new store, taken by the holdco and leased to the operator whether the restaurant is company run or franchised; and franchisee owned sites offered a sale and leaseback, so an owner converts trapped equity to cash and keeps running the store. Rent sits alongside royalty, the property finances against the lease, and depreciation shelters the distributions. A public records review of all 33 addresses costs nothing and establishes which sites are reachable.</w:t>
+        <w:t xml:space="preserve">The franchisor owns no property today. Four tracks build the position: the sites under the seven company operated restaurants, bought at appraised value from sellers already at the table; the site for every new store, taken by the holdco and leased to the operator whether the restaurant is company run or franchised; franchisee owned sites offered a sale and leaseback, so an owner converts trapped equity to cash and keeps running the store; and full exits, where the owner sells the store and the building together and the location converts to company operation. Rent sits alongside royalty, the property finances against the lease, and depreciation shelters the distributions. A public records review of all 33 addresses costs nothing and establishes which sites are reachable.</w:t>
       </w:r>
     </w:p>
     <w:p>
@@ -4291,7 +4291,7 @@
           <w:sz w:val="21"/>
           <w:szCs w:val="21"/>
         </w:rPr>
-        <w:t xml:space="preserve"> $900K to $1.4M across 90 to 120 days, itemized, capped, staged: the OA, license, and expired FA read comes first, and the heavy spend starts only if the OA shows a drag or majority manager rights. Includes an independent quality of earnings.</w:t>
+        <w:t xml:space="preserve"> $450K to $650K across 90 to 120 days, itemized, capped, staged: the OA, license, and expired FA read comes first, and the heavy spend starts only if the OA shows a drag or majority manager rights. Includes an independent quality of earnings.</w:t>
       </w:r>
     </w:p>
     <w:p>
@@ -4422,7 +4422,7 @@
           <w:sz w:val="21"/>
           <w:szCs w:val="21"/>
         </w:rPr>
-        <w:t xml:space="preserve"> At any gate: the budget spent to that point, $150K to $700K depending on when it dies. After closing: $5M to $8M of equity in a platform bought at 7.7x audited earnings all in, about 4.5x on the firm portion, with the earnout never paying for growth that did not happen. The numbers to model are above and in Exhibit B; the return case is Gart's to build.</w:t>
+        <w:t xml:space="preserve"> At any gate: the budget spent to that point, $100K to $500K depending on when it dies. After closing: $5M to $8M of equity in a platform bought at 7.7x audited earnings all in, about 4.5x on the firm portion, with the earnout never paying for growth that did not happen. The numbers to model are above and in Exhibit B; the return case is Gart's to build.</w:t>
       </w:r>
     </w:p>
     <w:p>

</xml_diff>